<commit_message>
Push for the 4rd checkup with th work of Thursday and Friday
</commit_message>
<xml_diff>
--- a/Documentation/Documentation_TPI_Ryan-Bersier.docx
+++ b/Documentation/Documentation_TPI_Ryan-Bersier.docx
@@ -217,7 +217,6 @@
             <w:docPartUnique/>
           </w:docPartObj>
         </w:sdtPr>
-        <w:sdtEndPr/>
         <w:sdtContent>
           <w:r>
             <w:rPr>
@@ -302,7 +301,6 @@
                                     <w:dataBinding w:prefixMappings="xmlns:ns0='http://purl.org/dc/elements/1.1/' xmlns:ns1='http://schemas.openxmlformats.org/package/2006/metadata/core-properties' " w:xpath="/ns1:coreProperties[1]/ns0:title[1]" w:storeItemID="{6C3C8BC8-F283-45AE-878A-BAB7291924A1}"/>
                                     <w:text/>
                                   </w:sdtPr>
-                                  <w:sdtEndPr/>
                                   <w:sdtContent>
                                     <w:p>
                                       <w:pPr>
@@ -349,7 +347,6 @@
                                     <w:dataBinding w:prefixMappings="xmlns:ns0='http://purl.org/dc/elements/1.1/' xmlns:ns1='http://schemas.openxmlformats.org/package/2006/metadata/core-properties' " w:xpath="/ns1:coreProperties[1]/ns0:subject[1]" w:storeItemID="{6C3C8BC8-F283-45AE-878A-BAB7291924A1}"/>
                                     <w:text/>
                                   </w:sdtPr>
-                                  <w:sdtEndPr/>
                                   <w:sdtContent>
                                     <w:p>
                                       <w:pPr>
@@ -426,7 +423,6 @@
                                     <w:dataBinding w:prefixMappings="xmlns:ns0='http://purl.org/dc/elements/1.1/' xmlns:ns1='http://schemas.openxmlformats.org/package/2006/metadata/core-properties' " w:xpath="/ns1:coreProperties[1]/ns0:creator[1]" w:storeItemID="{6C3C8BC8-F283-45AE-878A-BAB7291924A1}"/>
                                     <w:text/>
                                   </w:sdtPr>
-                                  <w:sdtEndPr/>
                                   <w:sdtContent>
                                     <w:p>
                                       <w:pPr>
@@ -508,7 +504,6 @@
                               <w:dataBinding w:prefixMappings="xmlns:ns0='http://purl.org/dc/elements/1.1/' xmlns:ns1='http://schemas.openxmlformats.org/package/2006/metadata/core-properties' " w:xpath="/ns1:coreProperties[1]/ns0:title[1]" w:storeItemID="{6C3C8BC8-F283-45AE-878A-BAB7291924A1}"/>
                               <w:text/>
                             </w:sdtPr>
-                            <w:sdtEndPr/>
                             <w:sdtContent>
                               <w:p>
                                 <w:pPr>
@@ -555,7 +550,6 @@
                               <w:dataBinding w:prefixMappings="xmlns:ns0='http://purl.org/dc/elements/1.1/' xmlns:ns1='http://schemas.openxmlformats.org/package/2006/metadata/core-properties' " w:xpath="/ns1:coreProperties[1]/ns0:subject[1]" w:storeItemID="{6C3C8BC8-F283-45AE-878A-BAB7291924A1}"/>
                               <w:text/>
                             </w:sdtPr>
-                            <w:sdtEndPr/>
                             <w:sdtContent>
                               <w:p>
                                 <w:pPr>
@@ -596,7 +590,6 @@
                               <w:dataBinding w:prefixMappings="xmlns:ns0='http://purl.org/dc/elements/1.1/' xmlns:ns1='http://schemas.openxmlformats.org/package/2006/metadata/core-properties' " w:xpath="/ns1:coreProperties[1]/ns0:creator[1]" w:storeItemID="{6C3C8BC8-F283-45AE-878A-BAB7291924A1}"/>
                               <w:text/>
                             </w:sdtPr>
-                            <w:sdtEndPr/>
                             <w:sdtContent>
                               <w:p>
                                 <w:pPr>
@@ -4366,7 +4359,7 @@
               <w:rPr>
                 <w:webHidden/>
               </w:rPr>
-              <w:t>26</w:t>
+              <w:t>27</w:t>
             </w:r>
             <w:r>
               <w:rPr>
@@ -4447,20 +4440,16 @@
                 <w:noProof/>
                 <w:webHidden/>
               </w:rPr>
-            </w:r>
-            <w:r>
-              <w:rPr>
-                <w:noProof/>
-                <w:webHidden/>
-              </w:rPr>
               <w:fldChar w:fldCharType="separate"/>
             </w:r>
             <w:r>
               <w:rPr>
-                <w:noProof/>
-                <w:webHidden/>
-              </w:rPr>
-              <w:t>26</w:t>
+                <w:b/>
+                <w:bCs/>
+                <w:noProof/>
+                <w:webHidden/>
+              </w:rPr>
+              <w:t>Erreur ! Signet non défini.</w:t>
             </w:r>
             <w:r>
               <w:rPr>
@@ -4555,7 +4544,7 @@
                 <w:noProof/>
                 <w:webHidden/>
               </w:rPr>
-              <w:t>27</w:t>
+              <w:t>28</w:t>
             </w:r>
             <w:r>
               <w:rPr>
@@ -4637,20 +4626,16 @@
                 <w:noProof/>
                 <w:webHidden/>
               </w:rPr>
-            </w:r>
-            <w:r>
-              <w:rPr>
-                <w:noProof/>
-                <w:webHidden/>
-              </w:rPr>
               <w:fldChar w:fldCharType="separate"/>
             </w:r>
             <w:r>
               <w:rPr>
-                <w:noProof/>
-                <w:webHidden/>
-              </w:rPr>
-              <w:t>27</w:t>
+                <w:b/>
+                <w:bCs/>
+                <w:noProof/>
+                <w:webHidden/>
+              </w:rPr>
+              <w:t>Erreur ! Signet non défini.</w:t>
             </w:r>
             <w:r>
               <w:rPr>
@@ -4745,7 +4730,7 @@
                 <w:noProof/>
                 <w:webHidden/>
               </w:rPr>
-              <w:t>27</w:t>
+              <w:t>31</w:t>
             </w:r>
             <w:r>
               <w:rPr>
@@ -4840,7 +4825,7 @@
                 <w:noProof/>
                 <w:webHidden/>
               </w:rPr>
-              <w:t>28</w:t>
+              <w:t>31</w:t>
             </w:r>
             <w:r>
               <w:rPr>
@@ -4918,7 +4903,7 @@
               <w:rPr>
                 <w:webHidden/>
               </w:rPr>
-              <w:t>28</w:t>
+              <w:t>32</w:t>
             </w:r>
             <w:r>
               <w:rPr>
@@ -5012,7 +4997,7 @@
                 <w:noProof/>
                 <w:webHidden/>
               </w:rPr>
-              <w:t>28</w:t>
+              <w:t>32</w:t>
             </w:r>
             <w:r>
               <w:rPr>
@@ -5107,7 +5092,7 @@
                 <w:noProof/>
                 <w:webHidden/>
               </w:rPr>
-              <w:t>29</w:t>
+              <w:t>32</w:t>
             </w:r>
             <w:r>
               <w:rPr>
@@ -5202,7 +5187,7 @@
                 <w:noProof/>
                 <w:webHidden/>
               </w:rPr>
-              <w:t>29</w:t>
+              <w:t>33</w:t>
             </w:r>
             <w:r>
               <w:rPr>
@@ -5297,7 +5282,7 @@
                 <w:noProof/>
                 <w:webHidden/>
               </w:rPr>
-              <w:t>30</w:t>
+              <w:t>33</w:t>
             </w:r>
             <w:r>
               <w:rPr>
@@ -5375,7 +5360,7 @@
               <w:rPr>
                 <w:webHidden/>
               </w:rPr>
-              <w:t>30</w:t>
+              <w:t>33</w:t>
             </w:r>
             <w:r>
               <w:rPr>
@@ -5452,7 +5437,7 @@
               <w:rPr>
                 <w:webHidden/>
               </w:rPr>
-              <w:t>31</w:t>
+              <w:t>35</w:t>
             </w:r>
             <w:r>
               <w:rPr>
@@ -5546,7 +5531,7 @@
                 <w:noProof/>
                 <w:webHidden/>
               </w:rPr>
-              <w:t>31</w:t>
+              <w:t>35</w:t>
             </w:r>
             <w:r>
               <w:rPr>
@@ -5641,7 +5626,7 @@
                 <w:noProof/>
                 <w:webHidden/>
               </w:rPr>
-              <w:t>31</w:t>
+              <w:t>35</w:t>
             </w:r>
             <w:r>
               <w:rPr>
@@ -5736,7 +5721,7 @@
                 <w:noProof/>
                 <w:webHidden/>
               </w:rPr>
-              <w:t>31</w:t>
+              <w:t>35</w:t>
             </w:r>
             <w:r>
               <w:rPr>
@@ -5831,7 +5816,7 @@
                 <w:noProof/>
                 <w:webHidden/>
               </w:rPr>
-              <w:t>31</w:t>
+              <w:t>35</w:t>
             </w:r>
             <w:r>
               <w:rPr>
@@ -5926,7 +5911,7 @@
                 <w:noProof/>
                 <w:webHidden/>
               </w:rPr>
-              <w:t>31</w:t>
+              <w:t>35</w:t>
             </w:r>
             <w:r>
               <w:rPr>
@@ -6021,7 +6006,7 @@
                 <w:noProof/>
                 <w:webHidden/>
               </w:rPr>
-              <w:t>31</w:t>
+              <w:t>35</w:t>
             </w:r>
             <w:r>
               <w:rPr>
@@ -7574,7 +7559,7 @@
         </w:rPr>
         <w:lastRenderedPageBreak/>
         <w:drawing>
-          <wp:inline distT="0" distB="0" distL="0" distR="0" wp14:anchorId="08501406" wp14:editId="386DBCB7">
+          <wp:inline distT="0" distB="0" distL="0" distR="0" wp14:anchorId="08501406" wp14:editId="0DEEF8EE">
             <wp:extent cx="3191774" cy="1799590"/>
             <wp:effectExtent l="0" t="0" r="8890" b="0"/>
             <wp:docPr id="2124286752" name="Image 13"/>

</xml_diff>